<commit_message>
dokumentáció frissítése és treffló frissítése
</commit_message>
<xml_diff>
--- a/documentation/vizsgaremek (cosmoScreen).docx
+++ b/documentation/vizsgaremek (cosmoScreen).docx
@@ -1,6 +1,6 @@
 
 <file path=word/document.xml><?xml version="1.0" encoding="utf-8"?>
-<w:document xmlns:wpc="http://schemas.microsoft.com/office/word/2010/wordprocessingCanvas" xmlns:cx="http://schemas.microsoft.com/office/drawing/2014/chartex" xmlns:cx1="http://schemas.microsoft.com/office/drawing/2015/9/8/chartex" xmlns:cx2="http://schemas.microsoft.com/office/drawing/2015/10/21/chartex" xmlns:cx3="http://schemas.microsoft.com/office/drawing/2016/5/9/chartex" xmlns:cx4="http://schemas.microsoft.com/office/drawing/2016/5/10/chartex" xmlns:cx5="http://schemas.microsoft.com/office/drawing/2016/5/11/chartex" xmlns:cx6="http://schemas.microsoft.com/office/drawing/2016/5/12/chartex" xmlns:cx7="http://schemas.microsoft.com/office/drawing/2016/5/13/chartex" xmlns:cx8="http://schemas.microsoft.com/office/drawing/2016/5/14/chartex" xmlns:mc="http://schemas.openxmlformats.org/markup-compatibility/2006" xmlns:aink="http://schemas.microsoft.com/office/drawing/2016/ink" xmlns:am3d="http://schemas.microsoft.com/office/drawing/2017/model3d" xmlns:o="urn:schemas-microsoft-com:office:office" xmlns:oel="http://schemas.microsoft.com/office/2019/extlst" xmlns:r="http://schemas.openxmlformats.org/officeDocument/2006/relationships" xmlns:m="http://schemas.openxmlformats.org/officeDocument/2006/math" xmlns:v="urn:schemas-microsoft-com:vml" xmlns:wp14="http://schemas.microsoft.com/office/word/2010/wordprocessingDrawing" xmlns:wp="http://schemas.openxmlformats.org/drawingml/2006/wordprocessingDrawing" xmlns:w10="urn:schemas-microsoft-com:office:word" xmlns:w="http://schemas.openxmlformats.org/wordprocessingml/2006/main" xmlns:w14="http://schemas.microsoft.com/office/word/2010/wordml" xmlns:w15="http://schemas.microsoft.com/office/word/2012/wordml" xmlns:w16cex="http://schemas.microsoft.com/office/word/2018/wordml/cex" xmlns:w16cid="http://schemas.microsoft.com/office/word/2016/wordml/cid" xmlns:w16="http://schemas.microsoft.com/office/word/2018/wordml" xmlns:w16du="http://schemas.microsoft.com/office/word/2023/wordml/word16du" xmlns:w16sdtdh="http://schemas.microsoft.com/office/word/2020/wordml/sdtdatahash" xmlns:w16sdtfl="http://schemas.microsoft.com/office/word/2024/wordml/sdtformatlock" xmlns:w16se="http://schemas.microsoft.com/office/word/2015/wordml/symex" xmlns:wpg="http://schemas.microsoft.com/office/word/2010/wordprocessingGroup" xmlns:wpi="http://schemas.microsoft.com/office/word/2010/wordprocessingInk" xmlns:wne="http://schemas.microsoft.com/office/word/2006/wordml" xmlns:wps="http://schemas.microsoft.com/office/word/2010/wordprocessingShape" mc:Ignorable="w14 w15 w16se w16cid w16 w16cex w16sdtdh w16sdtfl w16du wp14">
+<w:document xmlns:wpc="http://schemas.microsoft.com/office/word/2010/wordprocessingCanvas" xmlns:cx="http://schemas.microsoft.com/office/drawing/2014/chartex" xmlns:cx1="http://schemas.microsoft.com/office/drawing/2015/9/8/chartex" xmlns:cx2="http://schemas.microsoft.com/office/drawing/2015/10/21/chartex" xmlns:cx3="http://schemas.microsoft.com/office/drawing/2016/5/9/chartex" xmlns:cx4="http://schemas.microsoft.com/office/drawing/2016/5/10/chartex" xmlns:cx5="http://schemas.microsoft.com/office/drawing/2016/5/11/chartex" xmlns:cx6="http://schemas.microsoft.com/office/drawing/2016/5/12/chartex" xmlns:cx7="http://schemas.microsoft.com/office/drawing/2016/5/13/chartex" xmlns:cx8="http://schemas.microsoft.com/office/drawing/2016/5/14/chartex" xmlns:mc="http://schemas.openxmlformats.org/markup-compatibility/2006" xmlns:aink="http://schemas.microsoft.com/office/drawing/2016/ink" xmlns:am3d="http://schemas.microsoft.com/office/drawing/2017/model3d" xmlns:o="urn:schemas-microsoft-com:office:office" xmlns:r="http://schemas.openxmlformats.org/officeDocument/2006/relationships" xmlns:m="http://schemas.openxmlformats.org/officeDocument/2006/math" xmlns:v="urn:schemas-microsoft-com:vml" xmlns:wp14="http://schemas.microsoft.com/office/word/2010/wordprocessingDrawing" xmlns:wp="http://schemas.openxmlformats.org/drawingml/2006/wordprocessingDrawing" xmlns:w10="urn:schemas-microsoft-com:office:word" xmlns:w="http://schemas.openxmlformats.org/wordprocessingml/2006/main" xmlns:w14="http://schemas.microsoft.com/office/word/2010/wordml" xmlns:w15="http://schemas.microsoft.com/office/word/2012/wordml" xmlns:w16cid="http://schemas.microsoft.com/office/word/2016/wordml/cid" xmlns:w16se="http://schemas.microsoft.com/office/word/2015/wordml/symex" xmlns:wpg="http://schemas.microsoft.com/office/word/2010/wordprocessingGroup" xmlns:wpi="http://schemas.microsoft.com/office/word/2010/wordprocessingInk" xmlns:wne="http://schemas.microsoft.com/office/word/2006/wordml" xmlns:wps="http://schemas.microsoft.com/office/word/2010/wordprocessingShape" mc:Ignorable="w14 w15 w16se w16cid wp14">
   <w:body>
     <w:p>
       <w:pPr>
@@ -20,7 +20,27 @@
           <w:sz w:val="36"/>
           <w:szCs w:val="36"/>
         </w:rPr>
-        <w:t>Mozi (CosmoScreen)</w:t>
+        <w:t>Mozi (</w:t>
+      </w:r>
+      <w:proofErr w:type="spellStart"/>
+      <w:r>
+        <w:rPr>
+          <w:b/>
+          <w:bCs/>
+          <w:sz w:val="36"/>
+          <w:szCs w:val="36"/>
+        </w:rPr>
+        <w:t>CosmoScreen</w:t>
+      </w:r>
+      <w:proofErr w:type="spellEnd"/>
+      <w:r>
+        <w:rPr>
+          <w:b/>
+          <w:bCs/>
+          <w:sz w:val="36"/>
+          <w:szCs w:val="36"/>
+        </w:rPr>
+        <w:t>)</w:t>
       </w:r>
     </w:p>
     <w:p>
@@ -126,7 +146,15 @@
         <w:t>Adatbázis:</w:t>
       </w:r>
       <w:r>
-        <w:t xml:space="preserve"> MySql + PHP MyAdmin</w:t>
+        <w:t xml:space="preserve"> </w:t>
+      </w:r>
+      <w:proofErr w:type="spellStart"/>
+      <w:r>
+        <w:t>MySql</w:t>
+      </w:r>
+      <w:proofErr w:type="spellEnd"/>
+      <w:r>
+        <w:t xml:space="preserve"> + PHP MyAdmin</w:t>
       </w:r>
     </w:p>
     <w:p>
@@ -176,8 +204,21 @@
           <w:numId w:val="2"/>
         </w:numPr>
       </w:pPr>
-      <w:r>
-        <w:t>Admin tud felhasználó adatokat módosítani illetve új filmeket, szereplőket, előadás módot… felvenni.</w:t>
+      <w:proofErr w:type="spellStart"/>
+      <w:r>
+        <w:t>Admin</w:t>
+      </w:r>
+      <w:proofErr w:type="spellEnd"/>
+      <w:r>
+        <w:t xml:space="preserve"> tud felhasználó adatokat </w:t>
+      </w:r>
+      <w:proofErr w:type="gramStart"/>
+      <w:r>
+        <w:t>módosítani</w:t>
+      </w:r>
+      <w:proofErr w:type="gramEnd"/>
+      <w:r>
+        <w:t xml:space="preserve"> illetve új filmeket, szereplőket, előadás módot… felvenni.</w:t>
       </w:r>
     </w:p>
     <w:p>
@@ -210,7 +251,23 @@
         </w:numPr>
       </w:pPr>
       <w:r>
-        <w:t>A weblapon lesz mozi élmény(4dX, screenX, VIP) részletező ahol ki lesz fejtve mi micsoda</w:t>
+        <w:t xml:space="preserve">A weblapon lesz mozi </w:t>
+      </w:r>
+      <w:proofErr w:type="gramStart"/>
+      <w:r>
+        <w:t>élmény(</w:t>
+      </w:r>
+      <w:proofErr w:type="gramEnd"/>
+      <w:r>
+        <w:t xml:space="preserve">4dX, </w:t>
+      </w:r>
+      <w:proofErr w:type="spellStart"/>
+      <w:r>
+        <w:t>screenX</w:t>
+      </w:r>
+      <w:proofErr w:type="spellEnd"/>
+      <w:r>
+        <w:t>, VIP) részletező ahol ki lesz fejtve mi micsoda</w:t>
       </w:r>
     </w:p>
     <w:p>
@@ -221,7 +278,31 @@
         </w:numPr>
       </w:pPr>
       <w:r>
-        <w:t>A weblapon lesz Film katalógus, ahol adatokat jelenítünk meg a filmekről és egy gyorstalpalót hogy kb mit lehet várni a filtől.</w:t>
+        <w:t xml:space="preserve">A weblapon lesz Film katalógus, ahol adatokat jelenítünk meg a filmekről és egy </w:t>
+      </w:r>
+      <w:proofErr w:type="gramStart"/>
+      <w:r>
+        <w:t>gyorstalpalót</w:t>
+      </w:r>
+      <w:proofErr w:type="gramEnd"/>
+      <w:r>
+        <w:t xml:space="preserve"> hogy </w:t>
+      </w:r>
+      <w:proofErr w:type="spellStart"/>
+      <w:r>
+        <w:t>kb</w:t>
+      </w:r>
+      <w:proofErr w:type="spellEnd"/>
+      <w:r>
+        <w:t xml:space="preserve"> mit lehet várni a </w:t>
+      </w:r>
+      <w:proofErr w:type="spellStart"/>
+      <w:r>
+        <w:t>filtől</w:t>
+      </w:r>
+      <w:proofErr w:type="spellEnd"/>
+      <w:r>
+        <w:t>.</w:t>
       </w:r>
       <w:r>
         <w:rPr>
@@ -239,7 +320,15 @@
         </w:numPr>
       </w:pPr>
       <w:r>
-        <w:t>A weblap 2 nyelven lesz elérhető, Magyar és Angol.</w:t>
+        <w:t xml:space="preserve">A weblap 2 nyelven lesz elérhető, Magyar és </w:t>
+      </w:r>
+      <w:proofErr w:type="gramStart"/>
+      <w:r>
+        <w:t>Angol</w:t>
+      </w:r>
+      <w:proofErr w:type="gramEnd"/>
+      <w:r>
+        <w:t>.</w:t>
       </w:r>
     </w:p>
     <w:p>
@@ -250,7 +339,23 @@
         </w:numPr>
       </w:pPr>
       <w:r>
-        <w:t>Lesz egy film kereső funkcio ahol filmekre lehet keresni ez a katalógus oldalán lesz, illetve úgy is majd lehet keresni hogy mikor adják azt a bizonyos filmet.</w:t>
+        <w:t xml:space="preserve">Lesz egy film kereső </w:t>
+      </w:r>
+      <w:proofErr w:type="spellStart"/>
+      <w:r>
+        <w:t>funkcio</w:t>
+      </w:r>
+      <w:proofErr w:type="spellEnd"/>
+      <w:r>
+        <w:t xml:space="preserve"> ahol filmekre lehet keresni ez a katalógus oldalán lesz, illetve úgy is majd lehet </w:t>
+      </w:r>
+      <w:proofErr w:type="gramStart"/>
+      <w:r>
+        <w:t>keresni</w:t>
+      </w:r>
+      <w:proofErr w:type="gramEnd"/>
+      <w:r>
+        <w:t xml:space="preserve"> hogy mikor adják azt a bizonyos filmet.</w:t>
       </w:r>
     </w:p>
     <w:p>
@@ -261,7 +366,15 @@
         </w:numPr>
       </w:pPr>
       <w:r>
-        <w:t>Lesz egy általános vetítési kalendárium, ahol látja a felhasználó hogy melyik filmet mikor vetítjük.</w:t>
+        <w:t xml:space="preserve">Lesz egy általános vetítési kalendárium, ahol látja a </w:t>
+      </w:r>
+      <w:proofErr w:type="gramStart"/>
+      <w:r>
+        <w:t>felhasználó</w:t>
+      </w:r>
+      <w:proofErr w:type="gramEnd"/>
+      <w:r>
+        <w:t xml:space="preserve"> hogy melyik filmet mikor vetítjük.</w:t>
       </w:r>
     </w:p>
     <w:p>
@@ -331,8 +444,29 @@
           <w:bCs/>
         </w:rPr>
       </w:pPr>
-      <w:r>
-        <w:t>actors (id, name)</w:t>
+      <w:proofErr w:type="spellStart"/>
+      <w:r>
+        <w:t>actors</w:t>
+      </w:r>
+      <w:proofErr w:type="spellEnd"/>
+      <w:r>
+        <w:t xml:space="preserve"> (</w:t>
+      </w:r>
+      <w:proofErr w:type="spellStart"/>
+      <w:r>
+        <w:t>id</w:t>
+      </w:r>
+      <w:proofErr w:type="spellEnd"/>
+      <w:r>
+        <w:t xml:space="preserve">, </w:t>
+      </w:r>
+      <w:proofErr w:type="spellStart"/>
+      <w:r>
+        <w:t>name</w:t>
+      </w:r>
+      <w:proofErr w:type="spellEnd"/>
+      <w:r>
+        <w:t>)</w:t>
       </w:r>
     </w:p>
     <w:p>
@@ -342,8 +476,37 @@
           <w:numId w:val="1"/>
         </w:numPr>
       </w:pPr>
-      <w:r>
-        <w:t>actor_in_movie (id, movie_id, actor_id)</w:t>
+      <w:proofErr w:type="spellStart"/>
+      <w:r>
+        <w:t>actor_in_movie</w:t>
+      </w:r>
+      <w:proofErr w:type="spellEnd"/>
+      <w:r>
+        <w:t xml:space="preserve"> (</w:t>
+      </w:r>
+      <w:proofErr w:type="spellStart"/>
+      <w:r>
+        <w:t>id</w:t>
+      </w:r>
+      <w:proofErr w:type="spellEnd"/>
+      <w:r>
+        <w:t xml:space="preserve">, </w:t>
+      </w:r>
+      <w:proofErr w:type="spellStart"/>
+      <w:r>
+        <w:t>movie_id</w:t>
+      </w:r>
+      <w:proofErr w:type="spellEnd"/>
+      <w:r>
+        <w:t xml:space="preserve">, </w:t>
+      </w:r>
+      <w:proofErr w:type="spellStart"/>
+      <w:r>
+        <w:t>actor_id</w:t>
+      </w:r>
+      <w:proofErr w:type="spellEnd"/>
+      <w:r>
+        <w:t>)</w:t>
       </w:r>
     </w:p>
     <w:p>
@@ -353,8 +516,53 @@
           <w:numId w:val="1"/>
         </w:numPr>
       </w:pPr>
-      <w:r>
-        <w:t>buffet (id, name, price, description, img)</w:t>
+      <w:proofErr w:type="spellStart"/>
+      <w:r>
+        <w:t>buffet</w:t>
+      </w:r>
+      <w:proofErr w:type="spellEnd"/>
+      <w:r>
+        <w:t xml:space="preserve"> (</w:t>
+      </w:r>
+      <w:proofErr w:type="spellStart"/>
+      <w:r>
+        <w:t>id</w:t>
+      </w:r>
+      <w:proofErr w:type="spellEnd"/>
+      <w:r>
+        <w:t xml:space="preserve">, </w:t>
+      </w:r>
+      <w:proofErr w:type="spellStart"/>
+      <w:r>
+        <w:t>name</w:t>
+      </w:r>
+      <w:proofErr w:type="spellEnd"/>
+      <w:r>
+        <w:t xml:space="preserve">, </w:t>
+      </w:r>
+      <w:proofErr w:type="spellStart"/>
+      <w:r>
+        <w:t>price</w:t>
+      </w:r>
+      <w:proofErr w:type="spellEnd"/>
+      <w:r>
+        <w:t xml:space="preserve">, </w:t>
+      </w:r>
+      <w:proofErr w:type="spellStart"/>
+      <w:r>
+        <w:t>description</w:t>
+      </w:r>
+      <w:proofErr w:type="spellEnd"/>
+      <w:r>
+        <w:t xml:space="preserve">, </w:t>
+      </w:r>
+      <w:proofErr w:type="spellStart"/>
+      <w:r>
+        <w:t>img</w:t>
+      </w:r>
+      <w:proofErr w:type="spellEnd"/>
+      <w:r>
+        <w:t>)</w:t>
       </w:r>
     </w:p>
     <w:p>
@@ -364,8 +572,93 @@
           <w:numId w:val="1"/>
         </w:numPr>
       </w:pPr>
-      <w:r>
-        <w:t>movie (id, title, genre, runtime, director, production, age_restriction, show_in_id, poster, trailer)</w:t>
+      <w:proofErr w:type="spellStart"/>
+      <w:r>
+        <w:t>movie</w:t>
+      </w:r>
+      <w:proofErr w:type="spellEnd"/>
+      <w:r>
+        <w:t xml:space="preserve"> (</w:t>
+      </w:r>
+      <w:proofErr w:type="spellStart"/>
+      <w:r>
+        <w:t>id</w:t>
+      </w:r>
+      <w:proofErr w:type="spellEnd"/>
+      <w:r>
+        <w:t xml:space="preserve">, </w:t>
+      </w:r>
+      <w:proofErr w:type="spellStart"/>
+      <w:r>
+        <w:t>title</w:t>
+      </w:r>
+      <w:proofErr w:type="spellEnd"/>
+      <w:r>
+        <w:t xml:space="preserve">, </w:t>
+      </w:r>
+      <w:proofErr w:type="spellStart"/>
+      <w:r>
+        <w:t>genre</w:t>
+      </w:r>
+      <w:proofErr w:type="spellEnd"/>
+      <w:r>
+        <w:t xml:space="preserve">, </w:t>
+      </w:r>
+      <w:proofErr w:type="spellStart"/>
+      <w:r>
+        <w:t>runtime</w:t>
+      </w:r>
+      <w:proofErr w:type="spellEnd"/>
+      <w:r>
+        <w:t xml:space="preserve">, </w:t>
+      </w:r>
+      <w:proofErr w:type="spellStart"/>
+      <w:r>
+        <w:t>director</w:t>
+      </w:r>
+      <w:proofErr w:type="spellEnd"/>
+      <w:r>
+        <w:t xml:space="preserve">, </w:t>
+      </w:r>
+      <w:proofErr w:type="spellStart"/>
+      <w:r>
+        <w:t>production</w:t>
+      </w:r>
+      <w:proofErr w:type="spellEnd"/>
+      <w:r>
+        <w:t xml:space="preserve">, </w:t>
+      </w:r>
+      <w:proofErr w:type="spellStart"/>
+      <w:r>
+        <w:t>age_restriction</w:t>
+      </w:r>
+      <w:proofErr w:type="spellEnd"/>
+      <w:r>
+        <w:t xml:space="preserve">, </w:t>
+      </w:r>
+      <w:proofErr w:type="spellStart"/>
+      <w:r>
+        <w:t>show_in_id</w:t>
+      </w:r>
+      <w:proofErr w:type="spellEnd"/>
+      <w:r>
+        <w:t xml:space="preserve">, </w:t>
+      </w:r>
+      <w:proofErr w:type="spellStart"/>
+      <w:r>
+        <w:t>poster</w:t>
+      </w:r>
+      <w:proofErr w:type="spellEnd"/>
+      <w:r>
+        <w:t xml:space="preserve">, </w:t>
+      </w:r>
+      <w:proofErr w:type="spellStart"/>
+      <w:r>
+        <w:t>trailer</w:t>
+      </w:r>
+      <w:proofErr w:type="spellEnd"/>
+      <w:r>
+        <w:t>)</w:t>
       </w:r>
     </w:p>
     <w:p>
@@ -375,8 +668,45 @@
           <w:numId w:val="1"/>
         </w:numPr>
       </w:pPr>
-      <w:r>
-        <w:t>movie_screening (id, movie_id, room_id, language, start, end)</w:t>
+      <w:proofErr w:type="spellStart"/>
+      <w:r>
+        <w:t>movie_screening</w:t>
+      </w:r>
+      <w:proofErr w:type="spellEnd"/>
+      <w:r>
+        <w:t xml:space="preserve"> (</w:t>
+      </w:r>
+      <w:proofErr w:type="spellStart"/>
+      <w:r>
+        <w:t>id</w:t>
+      </w:r>
+      <w:proofErr w:type="spellEnd"/>
+      <w:r>
+        <w:t xml:space="preserve">, </w:t>
+      </w:r>
+      <w:proofErr w:type="spellStart"/>
+      <w:r>
+        <w:t>movie_id</w:t>
+      </w:r>
+      <w:proofErr w:type="spellEnd"/>
+      <w:r>
+        <w:t xml:space="preserve">, </w:t>
+      </w:r>
+      <w:proofErr w:type="spellStart"/>
+      <w:r>
+        <w:t>room_id</w:t>
+      </w:r>
+      <w:proofErr w:type="spellEnd"/>
+      <w:r>
+        <w:t xml:space="preserve">, </w:t>
+      </w:r>
+      <w:proofErr w:type="spellStart"/>
+      <w:r>
+        <w:t>language</w:t>
+      </w:r>
+      <w:proofErr w:type="spellEnd"/>
+      <w:r>
+        <w:t>, start, end)</w:t>
       </w:r>
     </w:p>
     <w:p>
@@ -386,8 +716,69 @@
           <w:numId w:val="1"/>
         </w:numPr>
       </w:pPr>
-      <w:r>
-        <w:t>reservation (id, user_id, total_amount, screening_id, reservation_date, ticket_id, seat_id)</w:t>
+      <w:proofErr w:type="spellStart"/>
+      <w:r>
+        <w:t>reservation</w:t>
+      </w:r>
+      <w:proofErr w:type="spellEnd"/>
+      <w:r>
+        <w:t xml:space="preserve"> (</w:t>
+      </w:r>
+      <w:proofErr w:type="spellStart"/>
+      <w:r>
+        <w:t>id</w:t>
+      </w:r>
+      <w:proofErr w:type="spellEnd"/>
+      <w:r>
+        <w:t xml:space="preserve">, </w:t>
+      </w:r>
+      <w:proofErr w:type="spellStart"/>
+      <w:r>
+        <w:t>user_id</w:t>
+      </w:r>
+      <w:proofErr w:type="spellEnd"/>
+      <w:r>
+        <w:t xml:space="preserve">, </w:t>
+      </w:r>
+      <w:proofErr w:type="spellStart"/>
+      <w:r>
+        <w:t>total_amount</w:t>
+      </w:r>
+      <w:proofErr w:type="spellEnd"/>
+      <w:r>
+        <w:t xml:space="preserve">, </w:t>
+      </w:r>
+      <w:proofErr w:type="spellStart"/>
+      <w:r>
+        <w:t>screening_id</w:t>
+      </w:r>
+      <w:proofErr w:type="spellEnd"/>
+      <w:r>
+        <w:t xml:space="preserve">, </w:t>
+      </w:r>
+      <w:proofErr w:type="spellStart"/>
+      <w:r>
+        <w:t>reservation_date</w:t>
+      </w:r>
+      <w:proofErr w:type="spellEnd"/>
+      <w:r>
+        <w:t xml:space="preserve">, </w:t>
+      </w:r>
+      <w:proofErr w:type="spellStart"/>
+      <w:r>
+        <w:t>ticket_id</w:t>
+      </w:r>
+      <w:proofErr w:type="spellEnd"/>
+      <w:r>
+        <w:t xml:space="preserve">, </w:t>
+      </w:r>
+      <w:proofErr w:type="spellStart"/>
+      <w:r>
+        <w:t>seat_id</w:t>
+      </w:r>
+      <w:proofErr w:type="spellEnd"/>
+      <w:r>
+        <w:t>)</w:t>
       </w:r>
     </w:p>
     <w:p>
@@ -397,8 +788,29 @@
           <w:numId w:val="1"/>
         </w:numPr>
       </w:pPr>
-      <w:r>
-        <w:t>rooms (id, capacity)</w:t>
+      <w:proofErr w:type="spellStart"/>
+      <w:r>
+        <w:t>rooms</w:t>
+      </w:r>
+      <w:proofErr w:type="spellEnd"/>
+      <w:r>
+        <w:t xml:space="preserve"> (</w:t>
+      </w:r>
+      <w:proofErr w:type="spellStart"/>
+      <w:r>
+        <w:t>id</w:t>
+      </w:r>
+      <w:proofErr w:type="spellEnd"/>
+      <w:r>
+        <w:t xml:space="preserve">, </w:t>
+      </w:r>
+      <w:proofErr w:type="spellStart"/>
+      <w:r>
+        <w:t>capacity</w:t>
+      </w:r>
+      <w:proofErr w:type="spellEnd"/>
+      <w:r>
+        <w:t>)</w:t>
       </w:r>
     </w:p>
     <w:p>
@@ -408,8 +820,45 @@
           <w:numId w:val="1"/>
         </w:numPr>
       </w:pPr>
-      <w:r>
-        <w:t>seats (id, room_id, seat_row, seat_column, status)</w:t>
+      <w:proofErr w:type="spellStart"/>
+      <w:r>
+        <w:t>seats</w:t>
+      </w:r>
+      <w:proofErr w:type="spellEnd"/>
+      <w:r>
+        <w:t xml:space="preserve"> (</w:t>
+      </w:r>
+      <w:proofErr w:type="spellStart"/>
+      <w:r>
+        <w:t>id</w:t>
+      </w:r>
+      <w:proofErr w:type="spellEnd"/>
+      <w:r>
+        <w:t xml:space="preserve">, </w:t>
+      </w:r>
+      <w:proofErr w:type="spellStart"/>
+      <w:r>
+        <w:t>room_id</w:t>
+      </w:r>
+      <w:proofErr w:type="spellEnd"/>
+      <w:r>
+        <w:t xml:space="preserve">, </w:t>
+      </w:r>
+      <w:proofErr w:type="spellStart"/>
+      <w:r>
+        <w:t>seat_row</w:t>
+      </w:r>
+      <w:proofErr w:type="spellEnd"/>
+      <w:r>
+        <w:t xml:space="preserve">, </w:t>
+      </w:r>
+      <w:proofErr w:type="spellStart"/>
+      <w:r>
+        <w:t>seat_column</w:t>
+      </w:r>
+      <w:proofErr w:type="spellEnd"/>
+      <w:r>
+        <w:t>, status)</w:t>
       </w:r>
     </w:p>
     <w:p>
@@ -419,8 +868,37 @@
           <w:numId w:val="1"/>
         </w:numPr>
       </w:pPr>
-      <w:r>
-        <w:t>tickets (id, type, price)</w:t>
+      <w:proofErr w:type="spellStart"/>
+      <w:r>
+        <w:t>tickets</w:t>
+      </w:r>
+      <w:proofErr w:type="spellEnd"/>
+      <w:r>
+        <w:t xml:space="preserve"> (</w:t>
+      </w:r>
+      <w:proofErr w:type="spellStart"/>
+      <w:r>
+        <w:t>id</w:t>
+      </w:r>
+      <w:proofErr w:type="spellEnd"/>
+      <w:r>
+        <w:t xml:space="preserve">, </w:t>
+      </w:r>
+      <w:proofErr w:type="spellStart"/>
+      <w:r>
+        <w:t>type</w:t>
+      </w:r>
+      <w:proofErr w:type="spellEnd"/>
+      <w:r>
+        <w:t xml:space="preserve">, </w:t>
+      </w:r>
+      <w:proofErr w:type="spellStart"/>
+      <w:r>
+        <w:t>price</w:t>
+      </w:r>
+      <w:proofErr w:type="spellEnd"/>
+      <w:r>
+        <w:t>)</w:t>
       </w:r>
     </w:p>
     <w:p>
@@ -431,8 +909,45 @@
         </w:numPr>
         <w:spacing w:after="360"/>
       </w:pPr>
-      <w:r>
-        <w:t>users (id, name, email, password, admin)</w:t>
+      <w:proofErr w:type="spellStart"/>
+      <w:r>
+        <w:t>users</w:t>
+      </w:r>
+      <w:proofErr w:type="spellEnd"/>
+      <w:r>
+        <w:t xml:space="preserve"> (</w:t>
+      </w:r>
+      <w:proofErr w:type="spellStart"/>
+      <w:r>
+        <w:t>id</w:t>
+      </w:r>
+      <w:proofErr w:type="spellEnd"/>
+      <w:r>
+        <w:t xml:space="preserve">, </w:t>
+      </w:r>
+      <w:proofErr w:type="spellStart"/>
+      <w:r>
+        <w:t>name</w:t>
+      </w:r>
+      <w:proofErr w:type="spellEnd"/>
+      <w:r>
+        <w:t xml:space="preserve">, email, </w:t>
+      </w:r>
+      <w:proofErr w:type="spellStart"/>
+      <w:r>
+        <w:t>password</w:t>
+      </w:r>
+      <w:proofErr w:type="spellEnd"/>
+      <w:r>
+        <w:t xml:space="preserve">, </w:t>
+      </w:r>
+      <w:proofErr w:type="spellStart"/>
+      <w:r>
+        <w:t>admin</w:t>
+      </w:r>
+      <w:proofErr w:type="spellEnd"/>
+      <w:r>
+        <w:t>)</w:t>
       </w:r>
     </w:p>
     <w:p>
@@ -624,13 +1139,26 @@
       </w:r>
     </w:p>
     <w:p>
-      <w:r>
+      <w:pPr>
         <w:rPr>
           <w:noProof/>
         </w:rPr>
-        <w:lastRenderedPageBreak/>
+      </w:pPr>
+      <w:r>
+        <w:rPr>
+          <w:noProof/>
+        </w:rPr>
+        <w:br w:type="page"/>
+      </w:r>
+    </w:p>
+    <w:p/>
+    <w:p>
+      <w:r>
+        <w:rPr>
+          <w:noProof/>
+        </w:rPr>
         <w:drawing>
-          <wp:inline distT="114300" distB="114300" distL="114300" distR="114300" wp14:anchorId="18EA63AE" wp14:editId="72FEC76D">
+          <wp:inline distT="114300" distB="114300" distL="114300" distR="114300" wp14:anchorId="0A3489D0" wp14:editId="1C97B56D">
             <wp:extent cx="4991100" cy="6553200"/>
             <wp:effectExtent l="0" t="0" r="0" b="0"/>
             <wp:docPr id="4" name="image4.png"/>
@@ -665,6 +1193,113 @@
           </wp:inline>
         </w:drawing>
       </w:r>
+      <w:r>
+        <w:br w:type="page"/>
+      </w:r>
+    </w:p>
+    <w:p>
+      <w:pPr>
+        <w:spacing w:before="360" w:after="360"/>
+        <w:jc w:val="center"/>
+        <w:rPr>
+          <w:b/>
+          <w:bCs/>
+          <w:sz w:val="32"/>
+        </w:rPr>
+      </w:pPr>
+      <w:proofErr w:type="spellStart"/>
+      <w:r>
+        <w:rPr>
+          <w:b/>
+          <w:bCs/>
+          <w:sz w:val="32"/>
+        </w:rPr>
+        <w:lastRenderedPageBreak/>
+        <w:t>Trelló</w:t>
+      </w:r>
+      <w:proofErr w:type="spellEnd"/>
+    </w:p>
+    <w:p>
+      <w:pPr>
+        <w:spacing w:before="360" w:after="360"/>
+        <w:rPr>
+          <w:bCs/>
+          <w:sz w:val="20"/>
+        </w:rPr>
+      </w:pPr>
+      <w:r>
+        <w:rPr>
+          <w:bCs/>
+          <w:sz w:val="20"/>
+        </w:rPr>
+        <w:t>2025.11.25</w:t>
+      </w:r>
+      <w:bookmarkStart w:id="0" w:name="_GoBack"/>
+      <w:bookmarkEnd w:id="0"/>
+    </w:p>
+    <w:p>
+      <w:pPr>
+        <w:spacing w:before="360" w:after="360"/>
+        <w:rPr>
+          <w:b/>
+          <w:bCs/>
+        </w:rPr>
+      </w:pPr>
+      <w:r>
+        <w:rPr>
+          <w:b/>
+          <w:bCs/>
+          <w:noProof/>
+        </w:rPr>
+        <w:drawing>
+          <wp:inline distT="0" distB="0" distL="0" distR="0" wp14:anchorId="1102305A" wp14:editId="238E8D0B">
+            <wp:extent cx="5732145" cy="2783840"/>
+            <wp:effectExtent l="0" t="0" r="1905" b="0"/>
+            <wp:docPr id="3" name="Kép 3"/>
+            <wp:cNvGraphicFramePr>
+              <a:graphicFrameLocks xmlns:a="http://schemas.openxmlformats.org/drawingml/2006/main" noChangeAspect="1"/>
+            </wp:cNvGraphicFramePr>
+            <a:graphic xmlns:a="http://schemas.openxmlformats.org/drawingml/2006/main">
+              <a:graphicData uri="http://schemas.openxmlformats.org/drawingml/2006/picture">
+                <pic:pic xmlns:pic="http://schemas.openxmlformats.org/drawingml/2006/picture">
+                  <pic:nvPicPr>
+                    <pic:cNvPr id="0" name="Picture 1"/>
+                    <pic:cNvPicPr>
+                      <a:picLocks noChangeAspect="1" noChangeArrowheads="1"/>
+                    </pic:cNvPicPr>
+                  </pic:nvPicPr>
+                  <pic:blipFill>
+                    <a:blip r:embed="rId10" cstate="print">
+                      <a:extLst>
+                        <a:ext uri="{28A0092B-C50C-407E-A947-70E740481C1C}">
+                          <a14:useLocalDpi xmlns:a14="http://schemas.microsoft.com/office/drawing/2010/main" val="0"/>
+                        </a:ext>
+                      </a:extLst>
+                    </a:blip>
+                    <a:srcRect/>
+                    <a:stretch>
+                      <a:fillRect/>
+                    </a:stretch>
+                  </pic:blipFill>
+                  <pic:spPr bwMode="auto">
+                    <a:xfrm>
+                      <a:off x="0" y="0"/>
+                      <a:ext cx="5732145" cy="2783840"/>
+                    </a:xfrm>
+                    <a:prstGeom prst="rect">
+                      <a:avLst/>
+                    </a:prstGeom>
+                    <a:noFill/>
+                    <a:ln>
+                      <a:noFill/>
+                    </a:ln>
+                  </pic:spPr>
+                </pic:pic>
+              </a:graphicData>
+            </a:graphic>
+          </wp:inline>
+        </w:drawing>
+      </w:r>
     </w:p>
     <w:sectPr>
       <w:pgSz w:w="11909" w:h="16834"/>
@@ -677,7 +1312,7 @@
 </file>
 
 <file path=word/numbering.xml><?xml version="1.0" encoding="utf-8"?>
-<w:numbering xmlns:wpc="http://schemas.microsoft.com/office/word/2010/wordprocessingCanvas" xmlns:cx="http://schemas.microsoft.com/office/drawing/2014/chartex" xmlns:cx1="http://schemas.microsoft.com/office/drawing/2015/9/8/chartex" xmlns:cx2="http://schemas.microsoft.com/office/drawing/2015/10/21/chartex" xmlns:cx3="http://schemas.microsoft.com/office/drawing/2016/5/9/chartex" xmlns:cx4="http://schemas.microsoft.com/office/drawing/2016/5/10/chartex" xmlns:cx5="http://schemas.microsoft.com/office/drawing/2016/5/11/chartex" xmlns:cx6="http://schemas.microsoft.com/office/drawing/2016/5/12/chartex" xmlns:cx7="http://schemas.microsoft.com/office/drawing/2016/5/13/chartex" xmlns:cx8="http://schemas.microsoft.com/office/drawing/2016/5/14/chartex" xmlns:mc="http://schemas.openxmlformats.org/markup-compatibility/2006" xmlns:aink="http://schemas.microsoft.com/office/drawing/2016/ink" xmlns:am3d="http://schemas.microsoft.com/office/drawing/2017/model3d" xmlns:o="urn:schemas-microsoft-com:office:office" xmlns:oel="http://schemas.microsoft.com/office/2019/extlst" xmlns:r="http://schemas.openxmlformats.org/officeDocument/2006/relationships" xmlns:m="http://schemas.openxmlformats.org/officeDocument/2006/math" xmlns:v="urn:schemas-microsoft-com:vml" xmlns:wp14="http://schemas.microsoft.com/office/word/2010/wordprocessingDrawing" xmlns:wp="http://schemas.openxmlformats.org/drawingml/2006/wordprocessingDrawing" xmlns:w10="urn:schemas-microsoft-com:office:word" xmlns:w="http://schemas.openxmlformats.org/wordprocessingml/2006/main" xmlns:w14="http://schemas.microsoft.com/office/word/2010/wordml" xmlns:w15="http://schemas.microsoft.com/office/word/2012/wordml" xmlns:w16cex="http://schemas.microsoft.com/office/word/2018/wordml/cex" xmlns:w16cid="http://schemas.microsoft.com/office/word/2016/wordml/cid" xmlns:w16="http://schemas.microsoft.com/office/word/2018/wordml" xmlns:w16du="http://schemas.microsoft.com/office/word/2023/wordml/word16du" xmlns:w16sdtdh="http://schemas.microsoft.com/office/word/2020/wordml/sdtdatahash" xmlns:w16sdtfl="http://schemas.microsoft.com/office/word/2024/wordml/sdtformatlock" xmlns:w16se="http://schemas.microsoft.com/office/word/2015/wordml/symex" xmlns:wpg="http://schemas.microsoft.com/office/word/2010/wordprocessingGroup" xmlns:wpi="http://schemas.microsoft.com/office/word/2010/wordprocessingInk" xmlns:wne="http://schemas.microsoft.com/office/word/2006/wordml" xmlns:wps="http://schemas.microsoft.com/office/word/2010/wordprocessingShape" mc:Ignorable="w14 w15 w16se w16cid w16 w16cex w16sdtdh w16sdtfl w16du wp14">
+<w:numbering xmlns:wpc="http://schemas.microsoft.com/office/word/2010/wordprocessingCanvas" xmlns:cx="http://schemas.microsoft.com/office/drawing/2014/chartex" xmlns:cx1="http://schemas.microsoft.com/office/drawing/2015/9/8/chartex" xmlns:cx2="http://schemas.microsoft.com/office/drawing/2015/10/21/chartex" xmlns:cx3="http://schemas.microsoft.com/office/drawing/2016/5/9/chartex" xmlns:cx4="http://schemas.microsoft.com/office/drawing/2016/5/10/chartex" xmlns:cx5="http://schemas.microsoft.com/office/drawing/2016/5/11/chartex" xmlns:cx6="http://schemas.microsoft.com/office/drawing/2016/5/12/chartex" xmlns:cx7="http://schemas.microsoft.com/office/drawing/2016/5/13/chartex" xmlns:cx8="http://schemas.microsoft.com/office/drawing/2016/5/14/chartex" xmlns:mc="http://schemas.openxmlformats.org/markup-compatibility/2006" xmlns:aink="http://schemas.microsoft.com/office/drawing/2016/ink" xmlns:am3d="http://schemas.microsoft.com/office/drawing/2017/model3d" xmlns:o="urn:schemas-microsoft-com:office:office" xmlns:r="http://schemas.openxmlformats.org/officeDocument/2006/relationships" xmlns:m="http://schemas.openxmlformats.org/officeDocument/2006/math" xmlns:v="urn:schemas-microsoft-com:vml" xmlns:wp14="http://schemas.microsoft.com/office/word/2010/wordprocessingDrawing" xmlns:wp="http://schemas.openxmlformats.org/drawingml/2006/wordprocessingDrawing" xmlns:w10="urn:schemas-microsoft-com:office:word" xmlns:w="http://schemas.openxmlformats.org/wordprocessingml/2006/main" xmlns:w14="http://schemas.microsoft.com/office/word/2010/wordml" xmlns:w15="http://schemas.microsoft.com/office/word/2012/wordml" xmlns:w16cid="http://schemas.microsoft.com/office/word/2016/wordml/cid" xmlns:w16se="http://schemas.microsoft.com/office/word/2015/wordml/symex" xmlns:wpg="http://schemas.microsoft.com/office/word/2010/wordprocessingGroup" xmlns:wpi="http://schemas.microsoft.com/office/word/2010/wordprocessingInk" xmlns:wne="http://schemas.microsoft.com/office/word/2006/wordml" xmlns:wps="http://schemas.microsoft.com/office/word/2010/wordprocessingShape" mc:Ignorable="w14 w15 w16se w16cid wp14">
   <w:abstractNum w:abstractNumId="0" w15:restartNumberingAfterBreak="0">
     <w:nsid w:val="289B77D4"/>
     <w:multiLevelType w:val="multilevel"/>
@@ -904,17 +1539,17 @@
       </w:rPr>
     </w:lvl>
   </w:abstractNum>
-  <w:num w:numId="1" w16cid:durableId="10305327">
+  <w:num w:numId="1">
     <w:abstractNumId w:val="1"/>
   </w:num>
-  <w:num w:numId="2" w16cid:durableId="1017123842">
+  <w:num w:numId="2">
     <w:abstractNumId w:val="0"/>
   </w:num>
 </w:numbering>
 </file>
 
 <file path=word/styles.xml><?xml version="1.0" encoding="utf-8"?>
-<w:styles xmlns:mc="http://schemas.openxmlformats.org/markup-compatibility/2006" xmlns:r="http://schemas.openxmlformats.org/officeDocument/2006/relationships" xmlns:w="http://schemas.openxmlformats.org/wordprocessingml/2006/main" xmlns:w14="http://schemas.microsoft.com/office/word/2010/wordml" xmlns:w15="http://schemas.microsoft.com/office/word/2012/wordml" xmlns:w16cex="http://schemas.microsoft.com/office/word/2018/wordml/cex" xmlns:w16cid="http://schemas.microsoft.com/office/word/2016/wordml/cid" xmlns:w16="http://schemas.microsoft.com/office/word/2018/wordml" xmlns:w16du="http://schemas.microsoft.com/office/word/2023/wordml/word16du" xmlns:w16sdtdh="http://schemas.microsoft.com/office/word/2020/wordml/sdtdatahash" xmlns:w16sdtfl="http://schemas.microsoft.com/office/word/2024/wordml/sdtformatlock" xmlns:w16se="http://schemas.microsoft.com/office/word/2015/wordml/symex" mc:Ignorable="w14 w15 w16se w16cid w16 w16cex w16sdtdh w16sdtfl w16du">
+<w:styles xmlns:mc="http://schemas.openxmlformats.org/markup-compatibility/2006" xmlns:r="http://schemas.openxmlformats.org/officeDocument/2006/relationships" xmlns:w="http://schemas.openxmlformats.org/wordprocessingml/2006/main" xmlns:w14="http://schemas.microsoft.com/office/word/2010/wordml" xmlns:w15="http://schemas.microsoft.com/office/word/2012/wordml" xmlns:w16cid="http://schemas.microsoft.com/office/word/2016/wordml/cid" xmlns:w16se="http://schemas.microsoft.com/office/word/2015/wordml/symex" mc:Ignorable="w14 w15 w16se w16cid">
   <w:docDefaults>
     <w:rPrDefault>
       <w:rPr>
@@ -930,7 +1565,7 @@
       </w:pPr>
     </w:pPrDefault>
   </w:docDefaults>
-  <w:latentStyles w:defLockedState="0" w:defUIPriority="99" w:defSemiHidden="0" w:defUnhideWhenUsed="0" w:defQFormat="0" w:count="376">
+  <w:latentStyles w:defLockedState="0" w:defUIPriority="99" w:defSemiHidden="0" w:defUnhideWhenUsed="0" w:defQFormat="0" w:count="375">
     <w:lsdException w:name="Normal" w:uiPriority="0" w:qFormat="1"/>
     <w:lsdException w:name="heading 1" w:uiPriority="9" w:qFormat="1"/>
     <w:lsdException w:name="heading 2" w:semiHidden="1" w:uiPriority="9" w:unhideWhenUsed="1" w:qFormat="1"/>
@@ -1306,16 +1941,15 @@
     <w:lsdException w:name="Smart Hyperlink" w:semiHidden="1" w:unhideWhenUsed="1"/>
     <w:lsdException w:name="Hashtag" w:semiHidden="1" w:unhideWhenUsed="1"/>
     <w:lsdException w:name="Unresolved Mention" w:semiHidden="1" w:unhideWhenUsed="1"/>
-    <w:lsdException w:name="Smart Link" w:semiHidden="1" w:unhideWhenUsed="1"/>
   </w:latentStyles>
-  <w:style w:type="paragraph" w:default="1" w:styleId="Normal">
+  <w:style w:type="paragraph" w:default="1" w:styleId="Norml">
     <w:name w:val="Normal"/>
     <w:qFormat/>
   </w:style>
-  <w:style w:type="paragraph" w:styleId="Heading1">
+  <w:style w:type="paragraph" w:styleId="Cmsor1">
     <w:name w:val="heading 1"/>
-    <w:basedOn w:val="Normal"/>
-    <w:next w:val="Normal"/>
+    <w:basedOn w:val="Norml"/>
+    <w:next w:val="Norml"/>
     <w:uiPriority w:val="9"/>
     <w:qFormat/>
     <w:pPr>
@@ -1329,10 +1963,10 @@
       <w:szCs w:val="40"/>
     </w:rPr>
   </w:style>
-  <w:style w:type="paragraph" w:styleId="Heading2">
+  <w:style w:type="paragraph" w:styleId="Cmsor2">
     <w:name w:val="heading 2"/>
-    <w:basedOn w:val="Normal"/>
-    <w:next w:val="Normal"/>
+    <w:basedOn w:val="Norml"/>
+    <w:next w:val="Norml"/>
     <w:uiPriority w:val="9"/>
     <w:semiHidden/>
     <w:unhideWhenUsed/>
@@ -1348,10 +1982,10 @@
       <w:szCs w:val="32"/>
     </w:rPr>
   </w:style>
-  <w:style w:type="paragraph" w:styleId="Heading3">
+  <w:style w:type="paragraph" w:styleId="Cmsor3">
     <w:name w:val="heading 3"/>
-    <w:basedOn w:val="Normal"/>
-    <w:next w:val="Normal"/>
+    <w:basedOn w:val="Norml"/>
+    <w:next w:val="Norml"/>
     <w:uiPriority w:val="9"/>
     <w:semiHidden/>
     <w:unhideWhenUsed/>
@@ -1368,10 +2002,10 @@
       <w:szCs w:val="28"/>
     </w:rPr>
   </w:style>
-  <w:style w:type="paragraph" w:styleId="Heading4">
+  <w:style w:type="paragraph" w:styleId="Cmsor4">
     <w:name w:val="heading 4"/>
-    <w:basedOn w:val="Normal"/>
-    <w:next w:val="Normal"/>
+    <w:basedOn w:val="Norml"/>
+    <w:next w:val="Norml"/>
     <w:uiPriority w:val="9"/>
     <w:semiHidden/>
     <w:unhideWhenUsed/>
@@ -1388,10 +2022,10 @@
       <w:szCs w:val="24"/>
     </w:rPr>
   </w:style>
-  <w:style w:type="paragraph" w:styleId="Heading5">
+  <w:style w:type="paragraph" w:styleId="Cmsor5">
     <w:name w:val="heading 5"/>
-    <w:basedOn w:val="Normal"/>
-    <w:next w:val="Normal"/>
+    <w:basedOn w:val="Norml"/>
+    <w:next w:val="Norml"/>
     <w:uiPriority w:val="9"/>
     <w:semiHidden/>
     <w:unhideWhenUsed/>
@@ -1406,10 +2040,10 @@
       <w:color w:val="666666"/>
     </w:rPr>
   </w:style>
-  <w:style w:type="paragraph" w:styleId="Heading6">
+  <w:style w:type="paragraph" w:styleId="Cmsor6">
     <w:name w:val="heading 6"/>
-    <w:basedOn w:val="Normal"/>
-    <w:next w:val="Normal"/>
+    <w:basedOn w:val="Norml"/>
+    <w:next w:val="Norml"/>
     <w:uiPriority w:val="9"/>
     <w:semiHidden/>
     <w:unhideWhenUsed/>
@@ -1426,13 +2060,13 @@
       <w:color w:val="666666"/>
     </w:rPr>
   </w:style>
-  <w:style w:type="character" w:default="1" w:styleId="DefaultParagraphFont">
+  <w:style w:type="character" w:default="1" w:styleId="Bekezdsalapbettpusa">
     <w:name w:val="Default Paragraph Font"/>
     <w:uiPriority w:val="1"/>
     <w:semiHidden/>
     <w:unhideWhenUsed/>
   </w:style>
-  <w:style w:type="table" w:default="1" w:styleId="TableNormal">
+  <w:style w:type="table" w:default="1" w:styleId="Normltblzat">
     <w:name w:val="Normal Table"/>
     <w:uiPriority w:val="99"/>
     <w:semiHidden/>
@@ -1447,13 +2081,13 @@
       </w:tblCellMar>
     </w:tblPr>
   </w:style>
-  <w:style w:type="numbering" w:default="1" w:styleId="NoList">
+  <w:style w:type="numbering" w:default="1" w:styleId="Nemlista">
     <w:name w:val="No List"/>
     <w:uiPriority w:val="99"/>
     <w:semiHidden/>
     <w:unhideWhenUsed/>
   </w:style>
-  <w:style w:type="table" w:customStyle="1" w:styleId="TableNormal0">
+  <w:style w:type="table" w:customStyle="1" w:styleId="TableNormal">
     <w:name w:val="TableNormal"/>
     <w:tblPr>
       <w:tblCellMar>
@@ -1464,10 +2098,10 @@
       </w:tblCellMar>
     </w:tblPr>
   </w:style>
-  <w:style w:type="paragraph" w:styleId="Title">
+  <w:style w:type="paragraph" w:styleId="Cm">
     <w:name w:val="Title"/>
-    <w:basedOn w:val="Normal"/>
-    <w:next w:val="Normal"/>
+    <w:basedOn w:val="Norml"/>
+    <w:next w:val="Norml"/>
     <w:uiPriority w:val="10"/>
     <w:qFormat/>
     <w:pPr>
@@ -1480,10 +2114,10 @@
       <w:szCs w:val="52"/>
     </w:rPr>
   </w:style>
-  <w:style w:type="paragraph" w:styleId="Subtitle">
+  <w:style w:type="paragraph" w:styleId="Alcm">
     <w:name w:val="Subtitle"/>
-    <w:basedOn w:val="Normal"/>
-    <w:next w:val="Normal"/>
+    <w:basedOn w:val="Norml"/>
+    <w:next w:val="Norml"/>
     <w:uiPriority w:val="11"/>
     <w:qFormat/>
     <w:pPr>

</xml_diff>